<commit_message>
test(corpus): add styles that inherit bold to the toggle documents
E-style-toggles and E-style-toggles-defaults gain ParaBoldInherit and
CharBoldInherit, based on bold styles without a w:b of their own, and
three cases that use them (16 to 18), so that the render shows what
ECMA-376 §17.7.3 and MS-OI29500 §17.7.3(c) say about an inherited toggle.
Cases 1 to 15 are unchanged. A style without run properties is written
without an empty w:rPr.

Co-Authored-By: Claude Opus 5.5 <noreply@anthropic.com>
</commit_message>
<xml_diff>
--- a/tests/corpus/word-rules/E-style-toggles-defaults.docx
+++ b/tests/corpus/word-rules/E-style-toggles-defaults.docx
@@ -138,6 +138,33 @@
           <w:b w:val="0"/>
         </w:rPr>
         <w:t xml:space="preserve">Case 15: paragraph style Normal, character style CharBold, direct b off</w:t>
+      </w:r>
+    </w:p>
+    <w:p>
+      <w:pPr>
+        <w:pStyle w:val="ParaBoldInherit"/>
+      </w:pPr>
+      <w:r>
+        <w:t xml:space="preserve">Case 16: paragraph style ParaBoldInherit, character style none, direct none</w:t>
+      </w:r>
+    </w:p>
+    <w:p>
+      <w:r>
+        <w:rPr>
+          <w:rStyle w:val="CharBoldInherit"/>
+        </w:rPr>
+        <w:t xml:space="preserve">Case 17: paragraph style Normal, character style CharBoldInherit, direct none</w:t>
+      </w:r>
+    </w:p>
+    <w:p>
+      <w:pPr>
+        <w:pStyle w:val="ParaBold"/>
+      </w:pPr>
+      <w:r>
+        <w:rPr>
+          <w:rStyle w:val="CharBoldInherit"/>
+        </w:rPr>
+        <w:t xml:space="preserve">Case 18: paragraph style ParaBold, character style CharBoldInherit, direct none</w:t>
       </w:r>
     </w:p>
     <w:sectPr>
@@ -221,6 +248,10 @@
       <w:b w:val="0"/>
     </w:rPr>
   </w:style>
+  <w:style w:type="paragraph" w:customStyle="1" w:styleId="ParaBoldInherit">
+    <w:name w:val="ParaBoldInherit"/>
+    <w:basedOn w:val="ParaBold"/>
+  </w:style>
   <w:style w:type="character" w:customStyle="1" w:styleId="CharBold">
     <w:name w:val="CharBold"/>
     <w:rPr>
@@ -241,5 +272,9 @@
       <w:b w:val="0"/>
     </w:rPr>
   </w:style>
+  <w:style w:type="character" w:customStyle="1" w:styleId="CharBoldInherit">
+    <w:name w:val="CharBoldInherit"/>
+    <w:basedOn w:val="CharBold"/>
+  </w:style>
 </w:styles>
 </file>
</xml_diff>

<commit_message>
test(corpus): inherit bold off in the toggle documents and check style names
With bold in the document defaults, cases 16 to 18 could only repeat
cases 2, 5 and 8. ParaBoldOffInherit and CharBoldOffInherit inherit
bold off without a w:b of their own; cases 19 and 20 use them, so the
render of E-style-toggles-defaults tells whether Word counts the levels
of a basedOn chain one by one (MS-OI29500 §17.7.3(a)).

The generator refuses a colour mapping attribute w:clrSchemeMapping does
not have, and a test checks that every style a document names exists,
since Word falls back to Normal without a word.

Co-Authored-By: Claude Opus 5.5 <noreply@anthropic.com>
</commit_message>
<xml_diff>
--- a/tests/corpus/word-rules/E-style-toggles-defaults.docx
+++ b/tests/corpus/word-rules/E-style-toggles-defaults.docx
@@ -165,6 +165,22 @@
           <w:rStyle w:val="CharBoldInherit"/>
         </w:rPr>
         <w:t xml:space="preserve">Case 18: paragraph style ParaBold, character style CharBoldInherit, direct none</w:t>
+      </w:r>
+    </w:p>
+    <w:p>
+      <w:pPr>
+        <w:pStyle w:val="ParaBoldOffInherit"/>
+      </w:pPr>
+      <w:r>
+        <w:t xml:space="preserve">Case 19: paragraph style ParaBoldOffInherit, character style none, direct none</w:t>
+      </w:r>
+    </w:p>
+    <w:p>
+      <w:r>
+        <w:rPr>
+          <w:rStyle w:val="CharBoldOffInherit"/>
+        </w:rPr>
+        <w:t xml:space="preserve">Case 20: paragraph style Normal, character style CharBoldOffInherit, direct none</w:t>
       </w:r>
     </w:p>
     <w:sectPr>
@@ -252,6 +268,10 @@
     <w:name w:val="ParaBoldInherit"/>
     <w:basedOn w:val="ParaBold"/>
   </w:style>
+  <w:style w:type="paragraph" w:customStyle="1" w:styleId="ParaBoldOffInherit">
+    <w:name w:val="ParaBoldOffInherit"/>
+    <w:basedOn w:val="ParaBoldOff"/>
+  </w:style>
   <w:style w:type="character" w:customStyle="1" w:styleId="CharBold">
     <w:name w:val="CharBold"/>
     <w:rPr>
@@ -276,5 +296,9 @@
     <w:name w:val="CharBoldInherit"/>
     <w:basedOn w:val="CharBold"/>
   </w:style>
+  <w:style w:type="character" w:customStyle="1" w:styleId="CharBoldOffInherit">
+    <w:name w:val="CharBoldOffInherit"/>
+    <w:basedOn w:val="CharBoldOff"/>
+  </w:style>
 </w:styles>
 </file>
</xml_diff>